<commit_message>
Report: describe the existing-process analysis accurately
Co-Authored-By: Claude Opus 5.5 <noreply@anthropic.com>
Claude-Session: https://claude.ai/code/session_01HvnpaKKY87Jw8DCoxkmmbb
</commit_message>
<xml_diff>
--- a/report/ShowUp_DBMS_Project_Report.docx
+++ b/report/ShowUp_DBMS_Project_Report.docx
@@ -513,7 +513,7 @@
           <w:sz w:val="20"/>
           <w:szCs w:val="20"/>
         </w:rPr>
-        <w:t xml:space="preserve">Interviews with club coordinators and inspection of typical registration sheets revealed the following deficiencies, each of which maps to a database concept:</w:t>
+        <w:t xml:space="preserve">An analysis of the Google Forms, spreadsheets and messaging-group workflows that clubs typically use revealed the following deficiencies, each of which maps to a database concept:</w:t>
       </w:r>
     </w:p>
     <w:p>
@@ -43436,7 +43436,7 @@
           <w:sz w:val="20"/>
           <w:szCs w:val="20"/>
         </w:rPr>
-        <w:t xml:space="preserve">The author thanks the faculty of the Database Management Systems course at Vellore Institute of Technology for their guidance, and the student club coordinators who described how event registration is handled today.</w:t>
+        <w:t xml:space="preserve">The author thanks the faculty of the Database Management Systems course at Vellore Institute of Technology for their guidance throughout this project.</w:t>
       </w:r>
     </w:p>
     <w:p>

</xml_diff>

<commit_message>
Report: add faculty guide Pooja Chaudhary
Co-Authored-By: Claude Opus 5.5 <noreply@anthropic.com>
Claude-Session: https://claude.ai/code/session_01HvnpaKKY87Jw8DCoxkmmbb
</commit_message>
<xml_diff>
--- a/report/ShowUp_DBMS_Project_Report.docx
+++ b/report/ShowUp_DBMS_Project_Report.docx
@@ -74,6 +74,20 @@
           <w:szCs w:val="20"/>
         </w:rPr>
         <w:t xml:space="preserve">Vellore Institute of Technology, Vellore, Tamil Nadu, India</w:t>
+      </w:r>
+    </w:p>
+    <w:p>
+      <w:pPr>
+        <w:spacing w:after="0" w:before="60"/>
+        <w:jc w:val="center"/>
+      </w:pPr>
+      <w:r>
+        <w:rPr>
+          <w:rFonts w:ascii="Times New Roman" w:cs="Times New Roman" w:eastAsia="Times New Roman" w:hAnsi="Times New Roman"/>
+          <w:sz w:val="20"/>
+          <w:szCs w:val="20"/>
+        </w:rPr>
+        <w:t xml:space="preserve">Faculty Guide: Pooja Chaudhary</w:t>
       </w:r>
     </w:p>
     <w:p>
@@ -43436,7 +43450,7 @@
           <w:sz w:val="20"/>
           <w:szCs w:val="20"/>
         </w:rPr>
-        <w:t xml:space="preserve">The author thanks the faculty of the Database Management Systems course at Vellore Institute of Technology for their guidance throughout this project.</w:t>
+        <w:t xml:space="preserve">The author sincerely thanks Pooja Chaudhary, faculty for the Database Management Systems course at Vellore Institute of Technology, for the guidance and support provided throughout this project.</w:t>
       </w:r>
     </w:p>
     <w:p>

</xml_diff>